<commit_message>
OP5: the assignment matches Journaler — Telefone, saved rounds, the reflection box, one exported PDF
Steps 2–3 name the app's own controls; the rubric's reflection row asks
for a saved round and a reflection that reads it; Format is the PDF
Journaler exports, not a one-page upload. The AI sentence OP1–4 have is
here in its OP5 form: the machine is required, Romano is optional.
Word had embedded six fonts (2.98 MB); stripped, it is 9 KB.

Co-Authored-By: Claude Opus 5 (1M context) <noreply@anthropic.com>
</commit_message>
<xml_diff>
--- a/week-05-breaking-the-rules/OP5 Breaking the Rules.docx
+++ b/week-05-breaking-the-rules/OP5 Breaking the Rules.docx
@@ -147,35 +147,53 @@
           <w:sz w:val="22"/>
           <w:szCs w:val="22"/>
         </w:rPr>
-        <w:t xml:space="preserve">In class, in Journaler, start the </w:t>
-      </w:r>
-      <w:r>
-        <w:rPr>
-          <w:rFonts w:eastAsia="Calibri" w:cs="Calibri"/>
-          <w:b/>
-          <w:bCs/>
-          <w:sz w:val="22"/>
-          <w:szCs w:val="22"/>
-        </w:rPr>
-        <w:t>5-minute timer</w:t>
-      </w:r>
-      <w:r>
-        <w:rPr>
-          <w:rFonts w:eastAsia="Calibri" w:cs="Calibri"/>
-          <w:sz w:val="22"/>
-          <w:szCs w:val="22"/>
-        </w:rPr>
-        <w:t xml:space="preserve">. Pick something that matters to you and write about it while </w:t>
-      </w:r>
-      <w:r>
-        <w:rPr>
-          <w:rFonts w:eastAsia="Calibri" w:cs="Calibri"/>
-          <w:b/>
-          <w:bCs/>
-          <w:sz w:val="22"/>
-          <w:szCs w:val="22"/>
-        </w:rPr>
-        <w:t>breaking the rules on purpose</w:t>
+        <w:t xml:space="preserve">In class, in Journaler (</w:t>
+      </w:r>
+      <w:r>
+        <w:rPr>
+          <w:rFonts w:eastAsia="Calibri" w:cs="Calibri"/>
+          <w:b/>
+          <w:bCs/>
+          <w:sz w:val="22"/>
+          <w:szCs w:val="22"/>
+        </w:rPr>
+        <w:t xml:space="preserve">Freewrite/OPs → 5 · Breaking the Rules</w:t>
+      </w:r>
+      <w:r>
+        <w:rPr>
+          <w:rFonts w:eastAsia="Calibri" w:cs="Calibri"/>
+          <w:sz w:val="22"/>
+          <w:szCs w:val="22"/>
+        </w:rPr>
+        <w:t xml:space="preserve">), set the clock to </w:t>
+      </w:r>
+      <w:r>
+        <w:rPr>
+          <w:rFonts w:eastAsia="Calibri" w:cs="Calibri"/>
+          <w:b/>
+          <w:bCs/>
+          <w:sz w:val="22"/>
+          <w:szCs w:val="22"/>
+        </w:rPr>
+        <w:t xml:space="preserve">5:00</w:t>
+      </w:r>
+      <w:r>
+        <w:rPr>
+          <w:rFonts w:eastAsia="Calibri" w:cs="Calibri"/>
+          <w:sz w:val="22"/>
+          <w:szCs w:val="22"/>
+        </w:rPr>
+        <w:t xml:space="preserve"> and start the gush. Pick something that matters to you and write about it while </w:t>
+      </w:r>
+      <w:r>
+        <w:rPr>
+          <w:rFonts w:eastAsia="Calibri" w:cs="Calibri"/>
+          <w:b/>
+          <w:bCs/>
+          <w:sz w:val="22"/>
+          <w:szCs w:val="22"/>
+        </w:rPr>
+        <w:t xml:space="preserve">breaking the rules on purpose</w:t>
       </w:r>
       <w:r>
         <w:rPr>
@@ -193,15 +211,33 @@
           <w:sz w:val="22"/>
           <w:szCs w:val="22"/>
         </w:rPr>
-        <w:t>two</w:t>
-      </w:r>
-      <w:r>
-        <w:rPr>
-          <w:rFonts w:eastAsia="Calibri" w:cs="Calibri"/>
-          <w:sz w:val="22"/>
-          <w:szCs w:val="22"/>
-        </w:rPr>
-        <w:t xml:space="preserve"> Grammar B moves (fragments, labyrinthine sentences, purposeful misspelling, double voice).</w:t>
+        <w:t xml:space="preserve">two</w:t>
+      </w:r>
+      <w:r>
+        <w:rPr>
+          <w:rFonts w:eastAsia="Calibri" w:cs="Calibri"/>
+          <w:sz w:val="22"/>
+          <w:szCs w:val="22"/>
+        </w:rPr>
+        <w:t xml:space="preserve"> Grammar B moves (fragments, labyrinthine sentences, purposeful misspelling, double voice). Said it before the clock runs out? </w:t>
+      </w:r>
+      <w:r>
+        <w:rPr>
+          <w:rFonts w:eastAsia="Calibri" w:cs="Calibri"/>
+          <w:b/>
+          <w:bCs/>
+          <w:sz w:val="22"/>
+          <w:szCs w:val="22"/>
+        </w:rPr>
+        <w:t xml:space="preserve">Done — stop the clock</w:t>
+      </w:r>
+      <w:r>
+        <w:rPr>
+          <w:rFonts w:eastAsia="Calibri" w:cs="Calibri"/>
+          <w:sz w:val="22"/>
+          <w:szCs w:val="22"/>
+        </w:rPr>
+        <w:t xml:space="preserve"> freezes it right there.</w:t>
       </w:r>
     </w:p>
     <w:p>
@@ -221,25 +257,25 @@
           <w:sz w:val="22"/>
           <w:szCs w:val="22"/>
         </w:rPr>
-        <w:t xml:space="preserve">Build a One-Pager: your rule-breaking piece, on one page. </w:t>
-      </w:r>
-      <w:r>
-        <w:rPr>
-          <w:rFonts w:eastAsia="Calibri" w:cs="Calibri"/>
-          <w:b/>
-          <w:bCs/>
-          <w:sz w:val="22"/>
-          <w:szCs w:val="22"/>
-        </w:rPr>
-        <w:t>Keep it broken.</w:t>
-      </w:r>
-      <w:r>
-        <w:rPr>
-          <w:rFonts w:eastAsia="Calibri" w:cs="Calibri"/>
-          <w:sz w:val="22"/>
-          <w:szCs w:val="22"/>
-        </w:rPr>
-        <w:t xml:space="preserve"> Every “error” should be one you meant.</w:t>
+        <w:t xml:space="preserve">Build a One-Pager: your rule-breaking piece, on one page. Keep it broken. Every “error” should be one you meant. That page is </w:t>
+      </w:r>
+      <w:r>
+        <w:rPr>
+          <w:rFonts w:eastAsia="Calibri" w:cs="Calibri"/>
+          <w:b/>
+          <w:bCs/>
+          <w:sz w:val="22"/>
+          <w:szCs w:val="22"/>
+        </w:rPr>
+        <w:t xml:space="preserve">pass zero</w:t>
+      </w:r>
+      <w:r>
+        <w:rPr>
+          <w:rFonts w:eastAsia="Calibri" w:cs="Calibri"/>
+          <w:sz w:val="22"/>
+          <w:szCs w:val="22"/>
+        </w:rPr>
+        <w:t xml:space="preserve">.</w:t>
       </w:r>
     </w:p>
     <w:p>
@@ -259,26 +295,133 @@
           <w:sz w:val="22"/>
           <w:szCs w:val="22"/>
         </w:rPr>
-        <w:t xml:space="preserve">The Generation Loss experiment is deliberately simple — one plain prompt, run over and over; the point isn’t the prompt, it’s watching what each pass erases. Your piece is pass zero. </w:t>
-      </w:r>
-      <w:r>
-        <w:rPr>
-          <w:rFonts w:eastAsia="Calibri" w:cs="Calibri"/>
-          <w:b/>
-          <w:bCs/>
-          <w:sz w:val="22"/>
-          <w:szCs w:val="22"/>
-          <w:shd w:fill="FFFF00" w:val="clear"/>
-        </w:rPr>
-        <w:t xml:space="preserve">Ask the machine to “clean this up and correct it” — that is pass one. </w:t>
-      </w:r>
-      <w:r>
-        <w:rPr>
-          <w:rFonts w:eastAsia="Calibri" w:cs="Calibri"/>
-          <w:sz w:val="22"/>
-          <w:szCs w:val="22"/>
-        </w:rPr>
-        <w:t>Run the same request on that, and again, out to pass ten. Save passes 0, 1, 5, and 10 side by side. Then write a short reflection: what did the machine fix first, and what is gone by pass ten that was there at the start? That part is yours.</w:t>
+        <w:t xml:space="preserve">Then play </w:t>
+      </w:r>
+      <w:r>
+        <w:rPr>
+          <w:rFonts w:eastAsia="Calibri" w:cs="Calibri"/>
+          <w:b/>
+          <w:bCs/>
+          <w:sz w:val="22"/>
+          <w:szCs w:val="22"/>
+        </w:rPr>
+        <w:t xml:space="preserve">Telefone</w:t>
+      </w:r>
+      <w:r>
+        <w:rPr>
+          <w:rFonts w:eastAsia="Calibri" w:cs="Calibri"/>
+          <w:sz w:val="22"/>
+          <w:szCs w:val="22"/>
+        </w:rPr>
+        <w:t xml:space="preserve"> — telephone, except the machine is every player. Under your One-Pager, press </w:t>
+      </w:r>
+      <w:r>
+        <w:rPr>
+          <w:rFonts w:eastAsia="Calibri" w:cs="Calibri"/>
+          <w:b/>
+          <w:bCs/>
+          <w:sz w:val="22"/>
+          <w:szCs w:val="22"/>
+        </w:rPr>
+        <w:t xml:space="preserve">Send this page to Telefone →</w:t>
+      </w:r>
+      <w:r>
+        <w:rPr>
+          <w:rFonts w:eastAsia="Calibri" w:cs="Calibri"/>
+          <w:sz w:val="22"/>
+          <w:szCs w:val="22"/>
+        </w:rPr>
+        <w:t xml:space="preserve">. The machine gets your page and three plain requests — </w:t>
+      </w:r>
+      <w:r>
+        <w:rPr>
+          <w:rFonts w:eastAsia="Calibri" w:cs="Calibri"/>
+          <w:i/>
+          <w:iCs/>
+          <w:sz w:val="22"/>
+          <w:szCs w:val="22"/>
+        </w:rPr>
+        <w:t xml:space="preserve">clean it up &amp; correct it · fix grammar, spelling, punctuation · rewrite in clear, standard English</w:t>
+      </w:r>
+      <w:r>
+        <w:rPr>
+          <w:rFonts w:eastAsia="Calibri" w:cs="Calibri"/>
+          <w:sz w:val="22"/>
+          <w:szCs w:val="22"/>
+        </w:rPr>
+        <w:t xml:space="preserve"> — and what comes back is pass one. Press </w:t>
+      </w:r>
+      <w:r>
+        <w:rPr>
+          <w:rFonts w:eastAsia="Calibri" w:cs="Calibri"/>
+          <w:b/>
+          <w:bCs/>
+          <w:sz w:val="22"/>
+          <w:szCs w:val="22"/>
+        </w:rPr>
+        <w:t xml:space="preserve">AI Revise</w:t>
+      </w:r>
+      <w:r>
+        <w:rPr>
+          <w:rFonts w:eastAsia="Calibri" w:cs="Calibri"/>
+          <w:sz w:val="22"/>
+          <w:szCs w:val="22"/>
+        </w:rPr>
+        <w:t xml:space="preserve"> again and pass two is made from pass one, not from yours; </w:t>
+      </w:r>
+      <w:r>
+        <w:rPr>
+          <w:rFonts w:eastAsia="Calibri" w:cs="Calibri"/>
+          <w:b/>
+          <w:bCs/>
+          <w:sz w:val="22"/>
+          <w:szCs w:val="22"/>
+        </w:rPr>
+        <w:t xml:space="preserve">×10</w:t>
+      </w:r>
+      <w:r>
+        <w:rPr>
+          <w:rFonts w:eastAsia="Calibri" w:cs="Calibri"/>
+          <w:sz w:val="22"/>
+          <w:szCs w:val="22"/>
+        </w:rPr>
+        <w:t xml:space="preserve"> runs ten at a time, up to twenty. The point isn’t the prompt, it’s watching what each pass erases: under every pass is how much of your page is still there. </w:t>
+      </w:r>
+      <w:r>
+        <w:rPr>
+          <w:rFonts w:eastAsia="Calibri" w:cs="Calibri"/>
+          <w:b/>
+          <w:bCs/>
+          <w:sz w:val="22"/>
+          <w:szCs w:val="22"/>
+        </w:rPr>
+        <w:t xml:space="preserve">Save at least one round</w:t>
+      </w:r>
+      <w:r>
+        <w:rPr>
+          <w:rFonts w:eastAsia="Calibri" w:cs="Calibri"/>
+          <w:sz w:val="22"/>
+          <w:szCs w:val="22"/>
+        </w:rPr>
+        <w:t xml:space="preserve"> — two or three is better: untick a request, or change the model, and play the same page again. Then write the </w:t>
+      </w:r>
+      <w:r>
+        <w:rPr>
+          <w:rFonts w:eastAsia="Calibri" w:cs="Calibri"/>
+          <w:b/>
+          <w:bCs/>
+          <w:sz w:val="22"/>
+          <w:szCs w:val="22"/>
+        </w:rPr>
+        <w:t xml:space="preserve">Generation Loss reflection</w:t>
+      </w:r>
+      <w:r>
+        <w:rPr>
+          <w:rFonts w:eastAsia="Calibri" w:cs="Calibri"/>
+          <w:sz w:val="22"/>
+          <w:szCs w:val="22"/>
+        </w:rPr>
+        <w:t xml:space="preserve"> in the box under your rounds: what did the machine fix first, what is gone by the end that was there at the start, what refused to go — and what that means for your writing and the writing of your students. That part is yours.</w:t>
       </w:r>
     </w:p>
     <w:p>
@@ -315,7 +458,7 @@
           <w:sz w:val="22"/>
           <w:szCs w:val="22"/>
         </w:rPr>
-        <w:t>One page. At least two Grammar B moves, on purpose. Include your reflection on the Generation Loss experiment. What is lost? What happened? What are your thoughts about this? Implications for your writing and the writing of your students?</w:t>
+        <w:t xml:space="preserve">Your One-Pager is one page. At least two Grammar B moves, on purpose. At least one saved Telefone round, and your Generation Loss reflection: What is lost? What happened? What are your thoughts about this? Implications for your writing and the writing of your students?</w:t>
       </w:r>
     </w:p>
     <w:p>
@@ -335,17 +478,43 @@
           <w:sz w:val="22"/>
           <w:szCs w:val="22"/>
         </w:rPr>
-        <w:t xml:space="preserve">Export as a one-page PDF via Canvas, </w:t>
-      </w:r>
-      <w:r>
-        <w:rPr>
-          <w:rFonts w:eastAsia="Calibri" w:cs="Calibri"/>
-          <w:b/>
-          <w:bCs/>
-          <w:sz w:val="22"/>
-          <w:szCs w:val="22"/>
-        </w:rPr>
-        <w:t>with your Generation Loss reflection.</w:t>
+        <w:t xml:space="preserve">At the bottom of One-Pager 5, press </w:t>
+      </w:r>
+      <w:r>
+        <w:rPr>
+          <w:rFonts w:eastAsia="Calibri" w:cs="Calibri"/>
+          <w:b/>
+          <w:bCs/>
+          <w:sz w:val="22"/>
+          <w:szCs w:val="22"/>
+        </w:rPr>
+        <w:t xml:space="preserve">Export One-Pager (PDF)</w:t>
+      </w:r>
+      <w:r>
+        <w:rPr>
+          <w:rFonts w:eastAsia="Calibri" w:cs="Calibri"/>
+          <w:sz w:val="22"/>
+          <w:szCs w:val="22"/>
+        </w:rPr>
+        <w:t xml:space="preserve"> and submit that PDF on Canvas. It carries everything: your One-Pager, your writing session and AI-use log, </w:t>
+      </w:r>
+      <w:r>
+        <w:rPr>
+          <w:rFonts w:eastAsia="Calibri" w:cs="Calibri"/>
+          <w:b/>
+          <w:bCs/>
+          <w:sz w:val="22"/>
+          <w:szCs w:val="22"/>
+        </w:rPr>
+        <w:t xml:space="preserve">your Generation Loss reflection, and your saved rounds</w:t>
+      </w:r>
+      <w:r>
+        <w:rPr>
+          <w:rFonts w:eastAsia="Calibri" w:cs="Calibri"/>
+          <w:sz w:val="22"/>
+          <w:szCs w:val="22"/>
+        </w:rPr>
+        <w:t xml:space="preserve">.</w:t>
       </w:r>
     </w:p>
     <w:p>
@@ -373,21 +542,28 @@
       <w:r>
         <w:rPr>
           <w:rFonts w:eastAsia="Calibri" w:cs="Calibri"/>
-          <w:b/>
-          <w:bCs/>
-          <w:sz w:val="22"/>
-          <w:szCs w:val="22"/>
-          <w:highlight w:val="yellow"/>
-        </w:rPr>
-        <w:t>Every broken rule should be one you meant.</w:t>
-      </w:r>
-      <w:r>
-        <w:rPr>
-          <w:rFonts w:eastAsia="Calibri" w:cs="Calibri"/>
-          <w:sz w:val="22"/>
-          <w:szCs w:val="22"/>
-        </w:rPr>
-        <w:t xml:space="preserve"> The machine will try to “correct” the very thing that makes it yours — that is the whole point. The judgment about what to keep is yours.</w:t>
+          <w:sz w:val="22"/>
+          <w:szCs w:val="22"/>
+        </w:rPr>
+        <w:t xml:space="preserve">Every broken rule should be one you meant. The machine will try to “correct” the very thing that makes it yours — that is the whole point. The judgment about what to keep is yours. </w:t>
+      </w:r>
+      <w:r>
+        <w:rPr>
+          <w:rFonts w:eastAsia="Calibri" w:cs="Calibri"/>
+          <w:b/>
+          <w:bCs/>
+          <w:sz w:val="22"/>
+          <w:szCs w:val="22"/>
+        </w:rPr>
+        <w:t xml:space="preserve">This is the one One-Pager that requires the machine: at least one saved Telefone round.</w:t>
+      </w:r>
+      <w:r>
+        <w:rPr>
+          <w:rFonts w:eastAsia="Calibri" w:cs="Calibri"/>
+          <w:sz w:val="22"/>
+          <w:szCs w:val="22"/>
+        </w:rPr>
+        <w:t xml:space="preserve"> Talking with Romano about your writing stays optional, here as everywhere.</w:t>
       </w:r>
     </w:p>
     <w:p>
@@ -535,7 +711,7 @@
                 <w:sz w:val="22"/>
                 <w:szCs w:val="22"/>
               </w:rPr>
-              <w:t>Reflect on the Generation Loss experiment. What is lost? What happened? What are your thoughts and implications for your writing and the writing of your students?</w:t>
+              <w:t>At least one saved Telefone round, and a reflection that reads it: what the machine fixed first, what is gone by the end, what refused to go — and what that means for your writing and the writing of your students.</w:t>
             </w:r>
           </w:p>
         </w:tc>
@@ -592,7 +768,7 @@
                 <w:sz w:val="22"/>
                 <w:szCs w:val="22"/>
               </w:rPr>
-              <w:t>One page, kept broken, submitted with your Generation Loss reflection.</w:t>
+              <w:t>Your One-Pager is one page, kept broken. Submitted as the one PDF Journaler exports: page, session, reflection, rounds.</w:t>
             </w:r>
           </w:p>
         </w:tc>

</xml_diff>

<commit_message>
Week 5: OP5 is introduced Wednesday, after the reps — Monday's launch block dropped (moves get 12 min each); Wed housekeeping opens the guidelines before the gush
Co-Authored-By: Claude Opus 5 (1M context) <noreply@anthropic.com>
</commit_message>
<xml_diff>
--- a/week-05-breaking-the-rules/OP5 Breaking the Rules.docx
+++ b/week-05-breaking-the-rules/OP5 Breaking the Rules.docx
@@ -1,6 +1,6 @@
 
 <file path=word/document.xml><?xml version="1.0" encoding="utf-8"?>
-<w:document xmlns:o="urn:schemas-microsoft-com:office:office" xmlns:r="http://schemas.openxmlformats.org/officeDocument/2006/relationships" xmlns:v="urn:schemas-microsoft-com:vml" xmlns:w="http://schemas.openxmlformats.org/wordprocessingml/2006/main" xmlns:w10="urn:schemas-microsoft-com:office:word" xmlns:wp="http://schemas.openxmlformats.org/drawingml/2006/wordprocessingDrawing" xmlns:wps="http://schemas.microsoft.com/office/word/2010/wordprocessingShape" xmlns:wpg="http://schemas.microsoft.com/office/word/2010/wordprocessingGroup" xmlns:mc="http://schemas.openxmlformats.org/markup-compatibility/2006" xmlns:wp14="http://schemas.microsoft.com/office/word/2010/wordprocessingDrawing" xmlns:w14="http://schemas.microsoft.com/office/word/2010/wordml" xmlns:w15="http://schemas.microsoft.com/office/word/2012/wordml" mc:Ignorable="w14 wp14 w15">
+<w:document xmlns:o="urn:schemas-microsoft-com:office:office" xmlns:r="http://schemas.openxmlformats.org/officeDocument/2006/relationships" xmlns:v="urn:schemas-microsoft-com:vml" xmlns:w="http://schemas.openxmlformats.org/wordprocessingml/2006/main" xmlns:w10="urn:schemas-microsoft-com:office:word" xmlns:wp="http://schemas.openxmlformats.org/drawingml/2006/wordprocessingDrawing" xmlns:pic="http://schemas.openxmlformats.org/drawingml/2006/picture" xmlns:wps="http://schemas.microsoft.com/office/word/2010/wordprocessingShape" xmlns:wpg="http://schemas.microsoft.com/office/word/2010/wordprocessingGroup" xmlns:mc="http://schemas.openxmlformats.org/markup-compatibility/2006" xmlns:wp14="http://schemas.microsoft.com/office/word/2010/wordprocessingDrawing" xmlns:w14="http://schemas.microsoft.com/office/word/2010/wordml" xmlns:w15="http://schemas.microsoft.com/office/word/2012/wordml" mc:Ignorable="w14 wp14 w15">
   <w:body>
     <w:p>
       <w:pPr>
@@ -147,17 +147,17 @@
           <w:sz w:val="22"/>
           <w:szCs w:val="22"/>
         </w:rPr>
-        <w:t xml:space="preserve">In class, in Journaler (</w:t>
-      </w:r>
-      <w:r>
-        <w:rPr>
-          <w:rFonts w:eastAsia="Calibri" w:cs="Calibri"/>
-          <w:b/>
-          <w:bCs/>
-          <w:sz w:val="22"/>
-          <w:szCs w:val="22"/>
-        </w:rPr>
-        <w:t xml:space="preserve">Freewrite/OPs → 5 · Breaking the Rules</w:t>
+        <w:t>In class, in Journaler (</w:t>
+      </w:r>
+      <w:r>
+        <w:rPr>
+          <w:rFonts w:eastAsia="Calibri" w:cs="Calibri"/>
+          <w:b/>
+          <w:bCs/>
+          <w:sz w:val="22"/>
+          <w:szCs w:val="22"/>
+        </w:rPr>
+        <w:t>Freewrite/OPs → 5 · Breaking the Rules</w:t>
       </w:r>
       <w:r>
         <w:rPr>
@@ -175,7 +175,7 @@
           <w:sz w:val="22"/>
           <w:szCs w:val="22"/>
         </w:rPr>
-        <w:t xml:space="preserve">5:00</w:t>
+        <w:t>5:00</w:t>
       </w:r>
       <w:r>
         <w:rPr>
@@ -193,7 +193,7 @@
           <w:sz w:val="22"/>
           <w:szCs w:val="22"/>
         </w:rPr>
-        <w:t xml:space="preserve">breaking the rules on purpose</w:t>
+        <w:t>breaking the rules on purpose</w:t>
       </w:r>
       <w:r>
         <w:rPr>
@@ -211,7 +211,7 @@
           <w:sz w:val="22"/>
           <w:szCs w:val="22"/>
         </w:rPr>
-        <w:t xml:space="preserve">two</w:t>
+        <w:t>two</w:t>
       </w:r>
       <w:r>
         <w:rPr>
@@ -229,7 +229,7 @@
           <w:sz w:val="22"/>
           <w:szCs w:val="22"/>
         </w:rPr>
-        <w:t xml:space="preserve">Done — stop the clock</w:t>
+        <w:t>Done — stop the clock</w:t>
       </w:r>
       <w:r>
         <w:rPr>
@@ -267,15 +267,15 @@
           <w:sz w:val="22"/>
           <w:szCs w:val="22"/>
         </w:rPr>
-        <w:t xml:space="preserve">pass zero</w:t>
-      </w:r>
-      <w:r>
-        <w:rPr>
-          <w:rFonts w:eastAsia="Calibri" w:cs="Calibri"/>
-          <w:sz w:val="22"/>
-          <w:szCs w:val="22"/>
-        </w:rPr>
-        <w:t xml:space="preserve">.</w:t>
+        <w:t>pass zero</w:t>
+      </w:r>
+      <w:r>
+        <w:rPr>
+          <w:rFonts w:eastAsia="Calibri" w:cs="Calibri"/>
+          <w:sz w:val="22"/>
+          <w:szCs w:val="22"/>
+        </w:rPr>
+        <w:t>.</w:t>
       </w:r>
     </w:p>
     <w:p>
@@ -305,25 +305,25 @@
           <w:sz w:val="22"/>
           <w:szCs w:val="22"/>
         </w:rPr>
-        <w:t xml:space="preserve">Telefone</w:t>
-      </w:r>
-      <w:r>
-        <w:rPr>
-          <w:rFonts w:eastAsia="Calibri" w:cs="Calibri"/>
-          <w:sz w:val="22"/>
-          <w:szCs w:val="22"/>
-        </w:rPr>
-        <w:t xml:space="preserve"> — telephone, except the machine is every player. Under your One-Pager, press </w:t>
-      </w:r>
-      <w:r>
-        <w:rPr>
-          <w:rFonts w:eastAsia="Calibri" w:cs="Calibri"/>
-          <w:b/>
-          <w:bCs/>
-          <w:sz w:val="22"/>
-          <w:szCs w:val="22"/>
-        </w:rPr>
-        <w:t xml:space="preserve">Send this page to Telefone →</w:t>
+        <w:t>Telefone</w:t>
+      </w:r>
+      <w:r>
+        <w:rPr>
+          <w:rFonts w:eastAsia="Calibri" w:cs="Calibri"/>
+          <w:sz w:val="22"/>
+          <w:szCs w:val="22"/>
+        </w:rPr>
+        <w:t xml:space="preserve">. Under your One-Pager, press </w:t>
+      </w:r>
+      <w:r>
+        <w:rPr>
+          <w:rFonts w:eastAsia="Calibri" w:cs="Calibri"/>
+          <w:b/>
+          <w:bCs/>
+          <w:sz w:val="22"/>
+          <w:szCs w:val="22"/>
+        </w:rPr>
+        <w:t>Send this page to Telefone →</w:t>
       </w:r>
       <w:r>
         <w:rPr>
@@ -341,7 +341,7 @@
           <w:sz w:val="22"/>
           <w:szCs w:val="22"/>
         </w:rPr>
-        <w:t xml:space="preserve">clean it up &amp; correct it · fix grammar, spelling, punctuation · rewrite in clear, standard English</w:t>
+        <w:t>clean it up &amp; correct it · fix grammar, spelling, punctuation · rewrite in clear, standard English</w:t>
       </w:r>
       <w:r>
         <w:rPr>
@@ -359,61 +359,43 @@
           <w:sz w:val="22"/>
           <w:szCs w:val="22"/>
         </w:rPr>
-        <w:t xml:space="preserve">AI Revise</w:t>
-      </w:r>
-      <w:r>
-        <w:rPr>
-          <w:rFonts w:eastAsia="Calibri" w:cs="Calibri"/>
-          <w:sz w:val="22"/>
-          <w:szCs w:val="22"/>
-        </w:rPr>
-        <w:t xml:space="preserve"> again and pass two is made from pass one, not from yours; </w:t>
-      </w:r>
-      <w:r>
-        <w:rPr>
-          <w:rFonts w:eastAsia="Calibri" w:cs="Calibri"/>
-          <w:b/>
-          <w:bCs/>
-          <w:sz w:val="22"/>
-          <w:szCs w:val="22"/>
-        </w:rPr>
-        <w:t xml:space="preserve">×10</w:t>
-      </w:r>
-      <w:r>
-        <w:rPr>
-          <w:rFonts w:eastAsia="Calibri" w:cs="Calibri"/>
-          <w:sz w:val="22"/>
-          <w:szCs w:val="22"/>
-        </w:rPr>
-        <w:t xml:space="preserve"> runs ten at a time, up to twenty. The point isn’t the prompt, it’s watching what each pass erases: under every pass is how much of your page is still there. </w:t>
-      </w:r>
-      <w:r>
-        <w:rPr>
-          <w:rFonts w:eastAsia="Calibri" w:cs="Calibri"/>
-          <w:b/>
-          <w:bCs/>
-          <w:sz w:val="22"/>
-          <w:szCs w:val="22"/>
-        </w:rPr>
-        <w:t xml:space="preserve">Save at least one round</w:t>
-      </w:r>
-      <w:r>
-        <w:rPr>
-          <w:rFonts w:eastAsia="Calibri" w:cs="Calibri"/>
-          <w:sz w:val="22"/>
-          <w:szCs w:val="22"/>
-        </w:rPr>
-        <w:t xml:space="preserve"> — two or three is better: untick a request, or change the model, and play the same page again. Then write the </w:t>
-      </w:r>
-      <w:r>
-        <w:rPr>
-          <w:rFonts w:eastAsia="Calibri" w:cs="Calibri"/>
-          <w:b/>
-          <w:bCs/>
-          <w:sz w:val="22"/>
-          <w:szCs w:val="22"/>
-        </w:rPr>
-        <w:t xml:space="preserve">Generation Loss reflection</w:t>
+        <w:t>AI Revise</w:t>
+      </w:r>
+      <w:r>
+        <w:rPr>
+          <w:rFonts w:eastAsia="Calibri" w:cs="Calibri"/>
+          <w:sz w:val="22"/>
+          <w:szCs w:val="22"/>
+        </w:rPr>
+        <w:t xml:space="preserve"> again and pass two is made from pass one, not from yours. The point isn’t the prompt, it’s watching what each pass erases: under every pass is how much of your page is still there. </w:t>
+      </w:r>
+      <w:r>
+        <w:rPr>
+          <w:rFonts w:eastAsia="Calibri" w:cs="Calibri"/>
+          <w:b/>
+          <w:bCs/>
+          <w:sz w:val="22"/>
+          <w:szCs w:val="22"/>
+        </w:rPr>
+        <w:t>Save at least one round</w:t>
+      </w:r>
+      <w:r>
+        <w:rPr>
+          <w:rFonts w:eastAsia="Calibri" w:cs="Calibri"/>
+          <w:sz w:val="22"/>
+          <w:szCs w:val="22"/>
+        </w:rPr>
+        <w:t xml:space="preserve"> — two or three is better. Then write the </w:t>
+      </w:r>
+      <w:r>
+        <w:rPr>
+          <w:rFonts w:eastAsia="Calibri" w:cs="Calibri"/>
+          <w:b/>
+          <w:bCs/>
+          <w:sz w:val="22"/>
+          <w:szCs w:val="22"/>
+        </w:rPr>
+        <w:t>Generation Loss reflection</w:t>
       </w:r>
       <w:r>
         <w:rPr>
@@ -488,7 +470,7 @@
           <w:sz w:val="22"/>
           <w:szCs w:val="22"/>
         </w:rPr>
-        <w:t xml:space="preserve">Export One-Pager (PDF)</w:t>
+        <w:t>Export One-Pager (PDF)</w:t>
       </w:r>
       <w:r>
         <w:rPr>
@@ -506,15 +488,15 @@
           <w:sz w:val="22"/>
           <w:szCs w:val="22"/>
         </w:rPr>
-        <w:t xml:space="preserve">your Generation Loss reflection, and your saved rounds</w:t>
-      </w:r>
-      <w:r>
-        <w:rPr>
-          <w:rFonts w:eastAsia="Calibri" w:cs="Calibri"/>
-          <w:sz w:val="22"/>
-          <w:szCs w:val="22"/>
-        </w:rPr>
-        <w:t xml:space="preserve">.</w:t>
+        <w:t>your Generation Loss reflection, and your saved rounds</w:t>
+      </w:r>
+      <w:r>
+        <w:rPr>
+          <w:rFonts w:eastAsia="Calibri" w:cs="Calibri"/>
+          <w:sz w:val="22"/>
+          <w:szCs w:val="22"/>
+        </w:rPr>
+        <w:t>.</w:t>
       </w:r>
     </w:p>
     <w:p>
@@ -555,7 +537,7 @@
           <w:sz w:val="22"/>
           <w:szCs w:val="22"/>
         </w:rPr>
-        <w:t xml:space="preserve">This is the one One-Pager that requires the machine: at least one saved Telefone round.</w:t>
+        <w:t>This is the one One-Pager that requires the machine: at least one saved Telefone round.</w:t>
       </w:r>
       <w:r>
         <w:rPr>
@@ -596,11 +578,11 @@
           <w:bottom w:w="40" w:type="dxa"/>
           <w:right w:w="108" w:type="dxa"/>
         </w:tblCellMar>
-        <w:tblLook w:val="07e0" w:noVBand="1" w:firstColumn="1"/>
+        <w:tblLook w:noVBand="1" w:firstColumn="1" w:val="07e0"/>
       </w:tblPr>
       <w:tblGrid>
         <w:gridCol w:w="2325"/>
-        <w:gridCol w:w="8474"/>
+        <w:gridCol w:w="8475"/>
       </w:tblGrid>
       <w:tr>
         <w:trPr/>
@@ -617,7 +599,7 @@
           <w:p>
             <w:pPr>
               <w:pStyle w:val="normal1"/>
-              <w:spacing w:lineRule="auto" w:line="276" w:before="0" w:after="0"/>
+              <w:spacing w:lineRule="auto" w:line="240" w:before="0" w:after="0"/>
               <w:rPr/>
             </w:pPr>
             <w:r>
@@ -634,7 +616,7 @@
         </w:tc>
         <w:tc>
           <w:tcPr>
-            <w:tcW w:w="8474" w:type="dxa"/>
+            <w:tcW w:w="8475" w:type="dxa"/>
             <w:tcBorders>
               <w:top w:val="single" w:sz="4" w:space="0" w:color="000000"/>
               <w:left w:val="single" w:sz="4" w:space="0" w:color="000000"/>
@@ -645,7 +627,7 @@
           <w:p>
             <w:pPr>
               <w:pStyle w:val="normal1"/>
-              <w:spacing w:lineRule="auto" w:line="276" w:before="0" w:after="0"/>
+              <w:spacing w:lineRule="auto" w:line="240" w:before="0" w:after="0"/>
               <w:rPr/>
             </w:pPr>
             <w:r>
@@ -674,7 +656,7 @@
           <w:p>
             <w:pPr>
               <w:pStyle w:val="normal1"/>
-              <w:spacing w:lineRule="auto" w:line="276" w:before="0" w:after="0"/>
+              <w:spacing w:lineRule="auto" w:line="240" w:before="0" w:after="0"/>
               <w:rPr/>
             </w:pPr>
             <w:r>
@@ -691,7 +673,7 @@
         </w:tc>
         <w:tc>
           <w:tcPr>
-            <w:tcW w:w="8474" w:type="dxa"/>
+            <w:tcW w:w="8475" w:type="dxa"/>
             <w:tcBorders>
               <w:top w:val="single" w:sz="4" w:space="0" w:color="000000"/>
               <w:left w:val="single" w:sz="4" w:space="0" w:color="000000"/>
@@ -702,7 +684,7 @@
           <w:p>
             <w:pPr>
               <w:pStyle w:val="normal1"/>
-              <w:spacing w:lineRule="auto" w:line="276" w:before="0" w:after="0"/>
+              <w:spacing w:lineRule="auto" w:line="240" w:before="0" w:after="0"/>
               <w:rPr/>
             </w:pPr>
             <w:r>
@@ -731,7 +713,7 @@
           <w:p>
             <w:pPr>
               <w:pStyle w:val="normal1"/>
-              <w:spacing w:lineRule="auto" w:line="276" w:before="0" w:after="0"/>
+              <w:spacing w:lineRule="auto" w:line="240" w:before="0" w:after="0"/>
               <w:rPr/>
             </w:pPr>
             <w:r>
@@ -748,7 +730,7 @@
         </w:tc>
         <w:tc>
           <w:tcPr>
-            <w:tcW w:w="8474" w:type="dxa"/>
+            <w:tcW w:w="8475" w:type="dxa"/>
             <w:tcBorders>
               <w:top w:val="single" w:sz="4" w:space="0" w:color="000000"/>
               <w:left w:val="single" w:sz="4" w:space="0" w:color="000000"/>
@@ -759,7 +741,7 @@
           <w:p>
             <w:pPr>
               <w:pStyle w:val="normal1"/>
-              <w:spacing w:lineRule="auto" w:line="276" w:before="0" w:after="0"/>
+              <w:spacing w:lineRule="auto" w:line="240" w:before="0" w:after="0"/>
               <w:rPr/>
             </w:pPr>
             <w:r>
@@ -1106,7 +1088,7 @@
     </w:rPr>
   </w:style>
   <w:style w:type="paragraph" w:styleId="Heading1">
-    <w:name w:val="Heading 1"/>
+    <w:name w:val="heading 1"/>
     <w:basedOn w:val="normal1"/>
     <w:next w:val="normal1"/>
     <w:qFormat/>
@@ -1125,7 +1107,7 @@
     </w:rPr>
   </w:style>
   <w:style w:type="paragraph" w:styleId="Heading2">
-    <w:name w:val="Heading 2"/>
+    <w:name w:val="heading 2"/>
     <w:basedOn w:val="normal1"/>
     <w:next w:val="normal1"/>
     <w:qFormat/>
@@ -1144,7 +1126,7 @@
     </w:rPr>
   </w:style>
   <w:style w:type="paragraph" w:styleId="Heading3">
-    <w:name w:val="Heading 3"/>
+    <w:name w:val="heading 3"/>
     <w:basedOn w:val="normal1"/>
     <w:next w:val="normal1"/>
     <w:qFormat/>
@@ -1161,7 +1143,7 @@
     </w:rPr>
   </w:style>
   <w:style w:type="paragraph" w:styleId="Heading4">
-    <w:name w:val="Heading 4"/>
+    <w:name w:val="heading 4"/>
     <w:basedOn w:val="normal1"/>
     <w:next w:val="normal1"/>
     <w:qFormat/>
@@ -1180,7 +1162,7 @@
     </w:rPr>
   </w:style>
   <w:style w:type="paragraph" w:styleId="Heading5">
-    <w:name w:val="Heading 5"/>
+    <w:name w:val="heading 5"/>
     <w:basedOn w:val="normal1"/>
     <w:next w:val="normal1"/>
     <w:qFormat/>
@@ -1195,7 +1177,7 @@
     </w:rPr>
   </w:style>
   <w:style w:type="paragraph" w:styleId="Heading6">
-    <w:name w:val="Heading 6"/>
+    <w:name w:val="heading 6"/>
     <w:basedOn w:val="normal1"/>
     <w:next w:val="normal1"/>
     <w:qFormat/>
@@ -1469,7 +1451,7 @@
     </w:rPr>
   </w:style>
   <w:style w:type="paragraph" w:styleId="Caption">
-    <w:name w:val="Caption"/>
+    <w:name w:val="caption"/>
     <w:basedOn w:val="Normal"/>
     <w:qFormat/>
     <w:pPr>
@@ -1576,34 +1558,34 @@
         <a:srgbClr val="000000"/>
       </a:dk1>
       <a:lt1>
-        <a:srgbClr val="ffffff"/>
+        <a:srgbClr val="FFFFFF"/>
       </a:lt1>
       <a:dk2>
-        <a:srgbClr val="1f497d"/>
+        <a:srgbClr val="1F497D"/>
       </a:dk2>
       <a:lt2>
-        <a:srgbClr val="eeece1"/>
+        <a:srgbClr val="EEECE1"/>
       </a:lt2>
       <a:accent1>
-        <a:srgbClr val="4f81bd"/>
+        <a:srgbClr val="4F81BD"/>
       </a:accent1>
       <a:accent2>
-        <a:srgbClr val="c0504d"/>
+        <a:srgbClr val="C0504D"/>
       </a:accent2>
       <a:accent3>
-        <a:srgbClr val="9bbb59"/>
+        <a:srgbClr val="9BBB59"/>
       </a:accent3>
       <a:accent4>
-        <a:srgbClr val="8064a2"/>
+        <a:srgbClr val="8064A2"/>
       </a:accent4>
       <a:accent5>
-        <a:srgbClr val="4bacc6"/>
+        <a:srgbClr val="4BACC6"/>
       </a:accent5>
       <a:accent6>
-        <a:srgbClr val="f79646"/>
+        <a:srgbClr val="F79646"/>
       </a:accent6>
       <a:hlink>
-        <a:srgbClr val="0000ff"/>
+        <a:srgbClr val="0000FF"/>
       </a:hlink>
       <a:folHlink>
         <a:srgbClr val="800080"/>

</xml_diff>

<commit_message>
Week 5 Wed + OP5: the in-class gush is the practice page; the real One-Pager is written at home and goes through Telefone as round 2; reflection compares the two rounds; rubric asks for both
Co-Authored-By: Claude Opus 5 (1M context) <noreply@anthropic.com>
</commit_message>
<xml_diff>
--- a/week-05-breaking-the-rules/OP5 Breaking the Rules.docx
+++ b/week-05-breaking-the-rules/OP5 Breaking the Rules.docx
@@ -144,6 +144,7 @@
       <w:r>
         <w:rPr>
           <w:rFonts w:eastAsia="Calibri" w:cs="Calibri"/>
+          <w:b w:val="0"/>
           <w:sz w:val="22"/>
           <w:szCs w:val="22"/>
         </w:rPr>
@@ -151,93 +152,87 @@
       </w:r>
       <w:r>
         <w:rPr>
-          <w:rFonts w:eastAsia="Calibri" w:cs="Calibri"/>
-          <w:b/>
-          <w:bCs/>
-          <w:sz w:val="22"/>
-          <w:szCs w:val="22"/>
+          <w:b/>
+          <w:sz w:val="22"/>
         </w:rPr>
         <w:t>Freewrite/OPs → 5 · Breaking the Rules</w:t>
       </w:r>
       <w:r>
         <w:rPr>
-          <w:rFonts w:eastAsia="Calibri" w:cs="Calibri"/>
-          <w:sz w:val="22"/>
-          <w:szCs w:val="22"/>
+          <w:b w:val="0"/>
+          <w:sz w:val="22"/>
         </w:rPr>
         <w:t xml:space="preserve">), set the clock to </w:t>
       </w:r>
       <w:r>
         <w:rPr>
-          <w:rFonts w:eastAsia="Calibri" w:cs="Calibri"/>
-          <w:b/>
-          <w:bCs/>
-          <w:sz w:val="22"/>
-          <w:szCs w:val="22"/>
+          <w:b/>
+          <w:sz w:val="22"/>
         </w:rPr>
         <w:t>5:00</w:t>
       </w:r>
       <w:r>
         <w:rPr>
-          <w:rFonts w:eastAsia="Calibri" w:cs="Calibri"/>
-          <w:sz w:val="22"/>
-          <w:szCs w:val="22"/>
+          <w:b w:val="0"/>
+          <w:sz w:val="22"/>
         </w:rPr>
         <w:t xml:space="preserve"> and start the gush. Pick something that matters to you and write about it while </w:t>
       </w:r>
       <w:r>
         <w:rPr>
-          <w:rFonts w:eastAsia="Calibri" w:cs="Calibri"/>
-          <w:b/>
-          <w:bCs/>
-          <w:sz w:val="22"/>
-          <w:szCs w:val="22"/>
+          <w:b/>
+          <w:sz w:val="22"/>
         </w:rPr>
         <w:t>breaking the rules on purpose</w:t>
       </w:r>
       <w:r>
         <w:rPr>
-          <w:rFonts w:eastAsia="Calibri" w:cs="Calibri"/>
-          <w:sz w:val="22"/>
-          <w:szCs w:val="22"/>
+          <w:b w:val="0"/>
+          <w:sz w:val="22"/>
         </w:rPr>
         <w:t xml:space="preserve"> — use at least </w:t>
       </w:r>
       <w:r>
         <w:rPr>
-          <w:rFonts w:eastAsia="Calibri" w:cs="Calibri"/>
-          <w:b/>
-          <w:bCs/>
-          <w:sz w:val="22"/>
-          <w:szCs w:val="22"/>
+          <w:b/>
+          <w:sz w:val="22"/>
         </w:rPr>
         <w:t>two</w:t>
       </w:r>
       <w:r>
         <w:rPr>
-          <w:rFonts w:eastAsia="Calibri" w:cs="Calibri"/>
-          <w:sz w:val="22"/>
-          <w:szCs w:val="22"/>
+          <w:b w:val="0"/>
+          <w:sz w:val="22"/>
         </w:rPr>
         <w:t xml:space="preserve"> Grammar B moves (fragments, labyrinthine sentences, purposeful misspelling, double voice). Said it before the clock runs out? </w:t>
       </w:r>
       <w:r>
         <w:rPr>
-          <w:rFonts w:eastAsia="Calibri" w:cs="Calibri"/>
-          <w:b/>
-          <w:bCs/>
-          <w:sz w:val="22"/>
-          <w:szCs w:val="22"/>
+          <w:b/>
+          <w:sz w:val="22"/>
         </w:rPr>
         <w:t>Done — stop the clock</w:t>
       </w:r>
       <w:r>
         <w:rPr>
-          <w:rFonts w:eastAsia="Calibri" w:cs="Calibri"/>
-          <w:sz w:val="22"/>
-          <w:szCs w:val="22"/>
-        </w:rPr>
-        <w:t xml:space="preserve"> freezes it right there.</w:t>
+          <w:b w:val="0"/>
+          <w:sz w:val="22"/>
+        </w:rPr>
+        <w:t xml:space="preserve"> freezes it right there. Shape it for two minutes, no more. That is your </w:t>
+      </w:r>
+      <w:r>
+        <w:rPr>
+          <w:b/>
+          <w:sz w:val="22"/>
+        </w:rPr>
+        <w:t>practice page</w:t>
+      </w:r>
+      <w:r>
+        <w:rPr>
+          <w:b w:val="0"/>
+          <w:sz w:val="22"/>
+        </w:rPr>
+        <w:t xml:space="preserve"> — it goes through the machine in class so you can see what the machine does. It is not the page you submit.</w:t>
       </w:r>
     </w:p>
     <w:p>
@@ -254,28 +249,39 @@
       <w:r>
         <w:rPr>
           <w:rFonts w:eastAsia="Calibri" w:cs="Calibri"/>
+          <w:b w:val="0"/>
           <w:sz w:val="22"/>
           <w:szCs w:val="22"/>
         </w:rPr>
-        <w:t xml:space="preserve">Build a One-Pager: your rule-breaking piece, on one page. Keep it broken. Every “error” should be one you meant. That page is </w:t>
-      </w:r>
-      <w:r>
-        <w:rPr>
-          <w:rFonts w:eastAsia="Calibri" w:cs="Calibri"/>
-          <w:b/>
-          <w:bCs/>
-          <w:sz w:val="22"/>
-          <w:szCs w:val="22"/>
+        <w:t xml:space="preserve">At home, with time, build the </w:t>
+      </w:r>
+      <w:r>
+        <w:rPr>
+          <w:b/>
+          <w:sz w:val="22"/>
+        </w:rPr>
+        <w:t>real One-Pager</w:t>
+      </w:r>
+      <w:r>
+        <w:rPr>
+          <w:b w:val="0"/>
+          <w:sz w:val="22"/>
+        </w:rPr>
+        <w:t xml:space="preserve">: your rule-breaking piece, on one page. Today's gush can be the seed or you can start fresh. Keep it broken. Every “error” should be one you meant. That page is </w:t>
+      </w:r>
+      <w:r>
+        <w:rPr>
+          <w:b/>
+          <w:sz w:val="22"/>
         </w:rPr>
         <w:t>pass zero</w:t>
       </w:r>
       <w:r>
         <w:rPr>
-          <w:rFonts w:eastAsia="Calibri" w:cs="Calibri"/>
-          <w:sz w:val="22"/>
-          <w:szCs w:val="22"/>
-        </w:rPr>
-        <w:t>.</w:t>
+          <w:b w:val="0"/>
+          <w:sz w:val="22"/>
+        </w:rPr>
+        <w:t xml:space="preserve"> for your second round.</w:t>
       </w:r>
     </w:p>
     <w:p>
@@ -292,6 +298,7 @@
       <w:r>
         <w:rPr>
           <w:rFonts w:eastAsia="Calibri" w:cs="Calibri"/>
+          <w:b w:val="0"/>
           <w:sz w:val="22"/>
           <w:szCs w:val="22"/>
         </w:rPr>
@@ -299,111 +306,101 @@
       </w:r>
       <w:r>
         <w:rPr>
-          <w:rFonts w:eastAsia="Calibri" w:cs="Calibri"/>
-          <w:b/>
-          <w:bCs/>
-          <w:sz w:val="22"/>
-          <w:szCs w:val="22"/>
+          <w:b/>
+          <w:sz w:val="22"/>
         </w:rPr>
         <w:t>Telefone</w:t>
       </w:r>
       <w:r>
         <w:rPr>
-          <w:rFonts w:eastAsia="Calibri" w:cs="Calibri"/>
-          <w:sz w:val="22"/>
-          <w:szCs w:val="22"/>
-        </w:rPr>
-        <w:t xml:space="preserve">. Under your One-Pager, press </w:t>
-      </w:r>
-      <w:r>
-        <w:rPr>
-          <w:rFonts w:eastAsia="Calibri" w:cs="Calibri"/>
-          <w:b/>
-          <w:bCs/>
-          <w:sz w:val="22"/>
-          <w:szCs w:val="22"/>
+          <w:b w:val="0"/>
+          <w:sz w:val="22"/>
+        </w:rPr>
+        <w:t xml:space="preserve"> — twice. Under your page, press </w:t>
+      </w:r>
+      <w:r>
+        <w:rPr>
+          <w:b/>
+          <w:sz w:val="22"/>
         </w:rPr>
         <w:t>Send this page to Telefone →</w:t>
       </w:r>
       <w:r>
         <w:rPr>
-          <w:rFonts w:eastAsia="Calibri" w:cs="Calibri"/>
-          <w:sz w:val="22"/>
-          <w:szCs w:val="22"/>
+          <w:b w:val="0"/>
+          <w:sz w:val="22"/>
         </w:rPr>
         <w:t xml:space="preserve">. The machine gets your page and three plain requests — </w:t>
       </w:r>
       <w:r>
         <w:rPr>
-          <w:rFonts w:eastAsia="Calibri" w:cs="Calibri"/>
-          <w:i/>
-          <w:iCs/>
-          <w:sz w:val="22"/>
-          <w:szCs w:val="22"/>
+          <w:b/>
+          <w:sz w:val="22"/>
         </w:rPr>
         <w:t>clean it up &amp; correct it · fix grammar, spelling, punctuation · rewrite in clear, standard English</w:t>
       </w:r>
       <w:r>
         <w:rPr>
-          <w:rFonts w:eastAsia="Calibri" w:cs="Calibri"/>
-          <w:sz w:val="22"/>
-          <w:szCs w:val="22"/>
+          <w:b w:val="0"/>
+          <w:sz w:val="22"/>
         </w:rPr>
         <w:t xml:space="preserve"> — and what comes back is pass one. Press </w:t>
       </w:r>
       <w:r>
         <w:rPr>
-          <w:rFonts w:eastAsia="Calibri" w:cs="Calibri"/>
-          <w:b/>
-          <w:bCs/>
-          <w:sz w:val="22"/>
-          <w:szCs w:val="22"/>
+          <w:b/>
+          <w:sz w:val="22"/>
         </w:rPr>
         <w:t>AI Revise</w:t>
       </w:r>
       <w:r>
         <w:rPr>
-          <w:rFonts w:eastAsia="Calibri" w:cs="Calibri"/>
-          <w:sz w:val="22"/>
-          <w:szCs w:val="22"/>
-        </w:rPr>
-        <w:t xml:space="preserve"> again and pass two is made from pass one, not from yours. The point isn’t the prompt, it’s watching what each pass erases: under every pass is how much of your page is still there. </w:t>
-      </w:r>
-      <w:r>
-        <w:rPr>
-          <w:rFonts w:eastAsia="Calibri" w:cs="Calibri"/>
-          <w:b/>
-          <w:bCs/>
-          <w:sz w:val="22"/>
-          <w:szCs w:val="22"/>
-        </w:rPr>
-        <w:t>Save at least one round</w:t>
-      </w:r>
-      <w:r>
-        <w:rPr>
-          <w:rFonts w:eastAsia="Calibri" w:cs="Calibri"/>
-          <w:sz w:val="22"/>
-          <w:szCs w:val="22"/>
-        </w:rPr>
-        <w:t xml:space="preserve"> — two or three is better. Then write the </w:t>
-      </w:r>
-      <w:r>
-        <w:rPr>
-          <w:rFonts w:eastAsia="Calibri" w:cs="Calibri"/>
-          <w:b/>
-          <w:bCs/>
-          <w:sz w:val="22"/>
-          <w:szCs w:val="22"/>
+          <w:b w:val="0"/>
+          <w:sz w:val="22"/>
+        </w:rPr>
+        <w:t xml:space="preserve"> again and pass two is made from pass one, not from yours; </w:t>
+      </w:r>
+      <w:r>
+        <w:rPr>
+          <w:b/>
+          <w:sz w:val="22"/>
+        </w:rPr>
+        <w:t>×10</w:t>
+      </w:r>
+      <w:r>
+        <w:rPr>
+          <w:b w:val="0"/>
+          <w:sz w:val="22"/>
+        </w:rPr>
+        <w:t xml:space="preserve"> runs ten at a time, up to twenty. The point isn’t the prompt, it’s watching what each pass erases: under every pass is how much of your page is still there. </w:t>
+      </w:r>
+      <w:r>
+        <w:rPr>
+          <w:b/>
+          <w:sz w:val="22"/>
+        </w:rPr>
+        <w:t>Round 1 is the practice page, in class. Round 2 is the finished page, at home.</w:t>
+      </w:r>
+      <w:r>
+        <w:rPr>
+          <w:b w:val="0"/>
+          <w:sz w:val="22"/>
+        </w:rPr>
+        <w:t xml:space="preserve"> Save both. Then write the </w:t>
+      </w:r>
+      <w:r>
+        <w:rPr>
+          <w:b/>
+          <w:sz w:val="22"/>
         </w:rPr>
         <w:t>Generation Loss reflection</w:t>
       </w:r>
       <w:r>
         <w:rPr>
-          <w:rFonts w:eastAsia="Calibri" w:cs="Calibri"/>
-          <w:sz w:val="22"/>
-          <w:szCs w:val="22"/>
-        </w:rPr>
-        <w:t xml:space="preserve"> in the box under your rounds: what did the machine fix first, what is gone by the end that was there at the start, what refused to go — and what that means for your writing and the writing of your students. That part is yours.</w:t>
+          <w:b w:val="0"/>
+          <w:sz w:val="22"/>
+        </w:rPr>
+        <w:t xml:space="preserve"> in the box under your rounds, with both in front of you: what did the machine fix first, what is gone by the end that was there at the start, what refused to go — did the finished page lose more than the gush, or less? — and what that means for your writing and the writing of your students. That part is yours.</w:t>
       </w:r>
     </w:p>
     <w:p>
@@ -437,10 +434,11 @@
       <w:r>
         <w:rPr>
           <w:rFonts w:eastAsia="Calibri" w:cs="Calibri"/>
+          <w:b w:val="0"/>
           <w:sz w:val="22"/>
           <w:szCs w:val="22"/>
         </w:rPr>
-        <w:t>Your One-Pager is one page. At least two Grammar B moves, on purpose. At least one saved Telefone round, and your Generation Loss reflection: what did the machine fix first, what is gone by the end that was there at the start, what refused to go — and what that means for your writing and the writing of your students.</w:t>
+        <w:t>Your One-Pager is one page. At least two Grammar B moves, on purpose. Two saved Telefone rounds — the practice page from class and the finished page — and your Generation Loss reflection: what did the machine fix first, what is gone by the end that was there at the start, what refused to go, how the two rounds compare — and what that means for your writing and the writing of your students.</w:t>
       </w:r>
     </w:p>
     <w:p>
@@ -524,6 +522,7 @@
       <w:r>
         <w:rPr>
           <w:rFonts w:eastAsia="Calibri" w:cs="Calibri"/>
+          <w:b w:val="0"/>
           <w:sz w:val="22"/>
           <w:szCs w:val="22"/>
         </w:rPr>
@@ -531,19 +530,15 @@
       </w:r>
       <w:r>
         <w:rPr>
-          <w:rFonts w:eastAsia="Calibri" w:cs="Calibri"/>
-          <w:b/>
-          <w:bCs/>
-          <w:sz w:val="22"/>
-          <w:szCs w:val="22"/>
-        </w:rPr>
-        <w:t>This is the one One-Pager that requires the machine: at least one saved Telefone round.</w:t>
-      </w:r>
-      <w:r>
-        <w:rPr>
-          <w:rFonts w:eastAsia="Calibri" w:cs="Calibri"/>
-          <w:sz w:val="22"/>
-          <w:szCs w:val="22"/>
+          <w:b/>
+          <w:sz w:val="22"/>
+        </w:rPr>
+        <w:t>This is the one One-Pager that requires the machine: a saved Telefone round on the finished page.</w:t>
+      </w:r>
+      <w:r>
+        <w:rPr>
+          <w:b w:val="0"/>
+          <w:sz w:val="22"/>
         </w:rPr>
         <w:t xml:space="preserve"> Talking with Romano about your writing stays optional, here as everywhere.</w:t>
       </w:r>
@@ -693,7 +688,7 @@
                 <w:sz w:val="22"/>
                 <w:szCs w:val="22"/>
               </w:rPr>
-              <w:t>At least one saved Telefone round, and a reflection that reads it: what the machine fixed first, what is gone by the end, what refused to go — and what that means for your writing and the writing of your students.</w:t>
+              <w:t>Two saved Telefone rounds — the practice page and the finished page — and a reflection that reads them: what the machine fixed first, what is gone by the end, what refused to go, how the two rounds compare — and what that means for your writing and the writing of your students.</w:t>
             </w:r>
           </w:p>
         </w:tc>

</xml_diff>

<commit_message>
Week 5 Wed: blocks in fives — 10/10/10/10/25/15; gush clock stays at the app's 8:00 (OP5 too)
Co-Authored-By: Claude Opus 5 (1M context) <noreply@anthropic.com>
</commit_message>
<xml_diff>
--- a/week-05-breaking-the-rules/OP5 Breaking the Rules.docx
+++ b/week-05-breaking-the-rules/OP5 Breaking the Rules.docx
@@ -162,14 +162,14 @@
           <w:b w:val="0"/>
           <w:sz w:val="22"/>
         </w:rPr>
-        <w:t xml:space="preserve">), set the clock to </w:t>
-      </w:r>
-      <w:r>
-        <w:rPr>
-          <w:b/>
-          <w:sz w:val="22"/>
-        </w:rPr>
-        <w:t>5:00</w:t>
+        <w:t xml:space="preserve">), leave the clock at </w:t>
+      </w:r>
+      <w:r>
+        <w:rPr>
+          <w:b/>
+          <w:sz w:val="22"/>
+        </w:rPr>
+        <w:t>8:00</w:t>
       </w:r>
       <w:r>
         <w:rPr>

</xml_diff>

<commit_message>
Week 5: replace the OP5 "Breaking the Rules" handout with the revised copy
Co-Authored-By: Claude Opus 5 (1M context) <noreply@anthropic.com>
</commit_message>
<xml_diff>
--- a/week-05-breaking-the-rules/OP5 Breaking the Rules.docx
+++ b/week-05-breaking-the-rules/OP5 Breaking the Rules.docx
@@ -1,6 +1,6 @@
 
 <file path=word/document.xml><?xml version="1.0" encoding="utf-8"?>
-<w:document xmlns:o="urn:schemas-microsoft-com:office:office" xmlns:r="http://schemas.openxmlformats.org/officeDocument/2006/relationships" xmlns:v="urn:schemas-microsoft-com:vml" xmlns:w="http://schemas.openxmlformats.org/wordprocessingml/2006/main" xmlns:w10="urn:schemas-microsoft-com:office:word" xmlns:wp="http://schemas.openxmlformats.org/drawingml/2006/wordprocessingDrawing" xmlns:pic="http://schemas.openxmlformats.org/drawingml/2006/picture" xmlns:wps="http://schemas.microsoft.com/office/word/2010/wordprocessingShape" xmlns:wpg="http://schemas.microsoft.com/office/word/2010/wordprocessingGroup" xmlns:mc="http://schemas.openxmlformats.org/markup-compatibility/2006" xmlns:wp14="http://schemas.microsoft.com/office/word/2010/wordprocessingDrawing" xmlns:w14="http://schemas.microsoft.com/office/word/2010/wordml" xmlns:w15="http://schemas.microsoft.com/office/word/2012/wordml" mc:Ignorable="w14 wp14 w15">
+<w:document xmlns:o="urn:schemas-microsoft-com:office:office" xmlns:r="http://schemas.openxmlformats.org/officeDocument/2006/relationships" xmlns:v="urn:schemas-microsoft-com:vml" xmlns:w="http://schemas.openxmlformats.org/wordprocessingml/2006/main" xmlns:w10="urn:schemas-microsoft-com:office:word" xmlns:wp="http://schemas.openxmlformats.org/drawingml/2006/wordprocessingDrawing" xmlns:wps="http://schemas.microsoft.com/office/word/2010/wordprocessingShape" xmlns:wpg="http://schemas.microsoft.com/office/word/2010/wordprocessingGroup" xmlns:mc="http://schemas.openxmlformats.org/markup-compatibility/2006" xmlns:wp14="http://schemas.microsoft.com/office/word/2010/wordprocessingDrawing" xmlns:w14="http://schemas.microsoft.com/office/word/2010/wordml" xmlns:w15="http://schemas.microsoft.com/office/word/2012/wordml" mc:Ignorable="w14 wp14 w15">
   <w:body>
     <w:p>
       <w:pPr>
@@ -144,7 +144,7 @@
       <w:r>
         <w:rPr>
           <w:rFonts w:eastAsia="Calibri" w:cs="Calibri"/>
-          <w:b w:val="0"/>
+          <w:b w:val="false"/>
           <w:sz w:val="22"/>
           <w:szCs w:val="22"/>
         </w:rPr>
@@ -159,7 +159,7 @@
       </w:r>
       <w:r>
         <w:rPr>
-          <w:b w:val="0"/>
+          <w:b w:val="false"/>
           <w:sz w:val="22"/>
         </w:rPr>
         <w:t xml:space="preserve">), leave the clock at </w:t>
@@ -173,7 +173,7 @@
       </w:r>
       <w:r>
         <w:rPr>
-          <w:b w:val="0"/>
+          <w:b w:val="false"/>
           <w:sz w:val="22"/>
         </w:rPr>
         <w:t xml:space="preserve"> and start the gush. Pick something that matters to you and write about it while </w:t>
@@ -187,7 +187,7 @@
       </w:r>
       <w:r>
         <w:rPr>
-          <w:b w:val="0"/>
+          <w:b w:val="false"/>
           <w:sz w:val="22"/>
         </w:rPr>
         <w:t xml:space="preserve"> — use at least </w:t>
@@ -201,24 +201,24 @@
       </w:r>
       <w:r>
         <w:rPr>
-          <w:b w:val="0"/>
-          <w:sz w:val="22"/>
-        </w:rPr>
-        <w:t xml:space="preserve"> Grammar B moves (fragments, labyrinthine sentences, purposeful misspelling, double voice). Said it before the clock runs out? </w:t>
-      </w:r>
-      <w:r>
-        <w:rPr>
-          <w:b/>
-          <w:sz w:val="22"/>
-        </w:rPr>
-        <w:t>Done — stop the clock</w:t>
-      </w:r>
-      <w:r>
-        <w:rPr>
-          <w:b w:val="0"/>
-          <w:sz w:val="22"/>
-        </w:rPr>
-        <w:t xml:space="preserve"> freezes it right there. Shape it for two minutes, no more. That is your </w:t>
+          <w:b w:val="false"/>
+          <w:sz w:val="22"/>
+        </w:rPr>
+        <w:t xml:space="preserve"> Grammar B moves (fragments, labyrinthine sentences, purposeful misspelling, double voice). </w:t>
+      </w:r>
+      <w:r>
+        <w:rPr>
+          <w:b w:val="false"/>
+          <w:sz w:val="22"/>
+        </w:rPr>
+        <w:t>This</w:t>
+      </w:r>
+      <w:r>
+        <w:rPr>
+          <w:b w:val="false"/>
+          <w:sz w:val="22"/>
+        </w:rPr>
+        <w:t xml:space="preserve"> is your </w:t>
       </w:r>
       <w:r>
         <w:rPr>
@@ -229,7 +229,7 @@
       </w:r>
       <w:r>
         <w:rPr>
-          <w:b w:val="0"/>
+          <w:b w:val="false"/>
           <w:sz w:val="22"/>
         </w:rPr>
         <w:t xml:space="preserve"> — it goes through the machine in class so you can see what the machine does. It is not the page you submit.</w:t>
@@ -249,7 +249,7 @@
       <w:r>
         <w:rPr>
           <w:rFonts w:eastAsia="Calibri" w:cs="Calibri"/>
-          <w:b w:val="0"/>
+          <w:b w:val="false"/>
           <w:sz w:val="22"/>
           <w:szCs w:val="22"/>
         </w:rPr>
@@ -264,7 +264,7 @@
       </w:r>
       <w:r>
         <w:rPr>
-          <w:b w:val="0"/>
+          <w:b w:val="false"/>
           <w:sz w:val="22"/>
         </w:rPr>
         <w:t xml:space="preserve">: your rule-breaking piece, on one page. Today's gush can be the seed or you can start fresh. Keep it broken. Every “error” should be one you meant. That page is </w:t>
@@ -278,7 +278,7 @@
       </w:r>
       <w:r>
         <w:rPr>
-          <w:b w:val="0"/>
+          <w:b w:val="false"/>
           <w:sz w:val="22"/>
         </w:rPr>
         <w:t xml:space="preserve"> for your second round.</w:t>
@@ -298,7 +298,7 @@
       <w:r>
         <w:rPr>
           <w:rFonts w:eastAsia="Calibri" w:cs="Calibri"/>
-          <w:b w:val="0"/>
+          <w:b w:val="false"/>
           <w:sz w:val="22"/>
           <w:szCs w:val="22"/>
         </w:rPr>
@@ -313,10 +313,10 @@
       </w:r>
       <w:r>
         <w:rPr>
-          <w:b w:val="0"/>
-          <w:sz w:val="22"/>
-        </w:rPr>
-        <w:t xml:space="preserve"> — twice. Under your page, press </w:t>
+          <w:b w:val="false"/>
+          <w:sz w:val="22"/>
+        </w:rPr>
+        <w:t xml:space="preserve">. Under your page, press </w:t>
       </w:r>
       <w:r>
         <w:rPr>
@@ -327,7 +327,7 @@
       </w:r>
       <w:r>
         <w:rPr>
-          <w:b w:val="0"/>
+          <w:b w:val="false"/>
           <w:sz w:val="22"/>
         </w:rPr>
         <w:t xml:space="preserve">. The machine gets your page and three plain requests — </w:t>
@@ -341,7 +341,7 @@
       </w:r>
       <w:r>
         <w:rPr>
-          <w:b w:val="0"/>
+          <w:b w:val="false"/>
           <w:sz w:val="22"/>
         </w:rPr>
         <w:t xml:space="preserve"> — and what comes back is pass one. Press </w:t>
@@ -355,7 +355,7 @@
       </w:r>
       <w:r>
         <w:rPr>
-          <w:b w:val="0"/>
+          <w:b w:val="false"/>
           <w:sz w:val="22"/>
         </w:rPr>
         <w:t xml:space="preserve"> again and pass two is made from pass one, not from yours; </w:t>
@@ -369,55 +369,10 @@
       </w:r>
       <w:r>
         <w:rPr>
-          <w:b w:val="0"/>
+          <w:b w:val="false"/>
           <w:sz w:val="22"/>
         </w:rPr>
         <w:t xml:space="preserve"> runs ten at a time, up to twenty. The point isn’t the prompt, it’s watching what each pass erases: under every pass is how much of your page is still there. </w:t>
-      </w:r>
-      <w:r>
-        <w:rPr>
-          <w:b/>
-          <w:sz w:val="22"/>
-        </w:rPr>
-        <w:t>Round 1 is the practice page, in class. Round 2 is the finished page, at home.</w:t>
-      </w:r>
-      <w:r>
-        <w:rPr>
-          <w:b w:val="0"/>
-          <w:sz w:val="22"/>
-        </w:rPr>
-        <w:t xml:space="preserve"> Save both. Then write the </w:t>
-      </w:r>
-      <w:r>
-        <w:rPr>
-          <w:b/>
-          <w:sz w:val="22"/>
-        </w:rPr>
-        <w:t>Generation Loss reflection</w:t>
-      </w:r>
-      <w:r>
-        <w:rPr>
-          <w:b w:val="0"/>
-          <w:sz w:val="22"/>
-        </w:rPr>
-        <w:t xml:space="preserve"> in the box under your rounds, with both in front of you: what did the machine fix first, what is gone by the end that was there at the start, what refused to go — did the finished page lose more than the gush, or less? — and what that means for your writing and the writing of your students. That part is yours.</w:t>
-      </w:r>
-    </w:p>
-    <w:p>
-      <w:pPr>
-        <w:pStyle w:val="Heading2"/>
-        <w:rPr/>
-      </w:pPr>
-      <w:r>
-        <w:rPr>
-          <w:rFonts w:eastAsia="Calibri" w:cs="Calibri"/>
-          <w:b/>
-          <w:bCs/>
-          <w:color w:val="4F81BD"/>
-          <w:sz w:val="26"/>
-          <w:szCs w:val="26"/>
-        </w:rPr>
-        <w:t>3. Length &amp; Format</w:t>
       </w:r>
     </w:p>
     <w:p>
@@ -433,12 +388,55 @@
       </w:pPr>
       <w:r>
         <w:rPr>
-          <w:rFonts w:eastAsia="Calibri" w:cs="Calibri"/>
-          <w:b w:val="0"/>
-          <w:sz w:val="22"/>
-          <w:szCs w:val="22"/>
-        </w:rPr>
-        <w:t>Your One-Pager is one page. At least two Grammar B moves, on purpose. Two saved Telefone rounds — the practice page from class and the finished page — and your Generation Loss reflection: what did the machine fix first, what is gone by the end that was there at the start, what refused to go, how the two rounds compare — and what that means for your writing and the writing of your students.</w:t>
+          <w:b w:val="false"/>
+          <w:sz w:val="22"/>
+        </w:rPr>
+        <w:t xml:space="preserve">In Journaler, </w:t>
+      </w:r>
+      <w:r>
+        <w:rPr>
+          <w:b/>
+          <w:sz w:val="22"/>
+        </w:rPr>
+        <w:t>Round 1 is the practice page, in class. Round 2 is the finished page, at home.</w:t>
+      </w:r>
+      <w:r>
+        <w:rPr>
+          <w:b w:val="false"/>
+          <w:sz w:val="22"/>
+        </w:rPr>
+        <w:t xml:space="preserve"> Save both. Then write the </w:t>
+      </w:r>
+      <w:r>
+        <w:rPr>
+          <w:b/>
+          <w:sz w:val="22"/>
+        </w:rPr>
+        <w:t>Generation Loss reflection</w:t>
+      </w:r>
+      <w:r>
+        <w:rPr>
+          <w:b w:val="false"/>
+          <w:sz w:val="22"/>
+        </w:rPr>
+        <w:t xml:space="preserve"> in the box under your rounds, with both in front of you: what did the machine fix first, what is gone by the end that was there at the start, what refused to go — did the finished page lose more than the gush, or less? — and what that means for your writing and the writing of your students. That part is yours.</w:t>
+      </w:r>
+    </w:p>
+    <w:p>
+      <w:pPr>
+        <w:pStyle w:val="Heading2"/>
+        <w:rPr/>
+      </w:pPr>
+      <w:r>
+        <w:rPr>
+          <w:rFonts w:eastAsia="Calibri" w:cs="Calibri"/>
+          <w:b/>
+          <w:bCs/>
+          <w:color w:val="4F81BD"/>
+          <w:sz w:val="26"/>
+          <w:szCs w:val="26"/>
+        </w:rPr>
+        <w:t>3. Length &amp; Format</w:t>
       </w:r>
     </w:p>
     <w:p>
@@ -455,6 +453,27 @@
       <w:r>
         <w:rPr>
           <w:rFonts w:eastAsia="Calibri" w:cs="Calibri"/>
+          <w:b w:val="false"/>
+          <w:sz w:val="22"/>
+          <w:szCs w:val="22"/>
+        </w:rPr>
+        <w:t>Your One-Pager is one page. At least two Grammar B moves, on purpose. Two saved Telefone rounds — the practice page from class and the finished page — and your Generation Loss reflection: what did the machine fix first, what is gone by the end that was there at the start, what refused to go, how the two rounds compare — and what that means for your writing and the writing of your students.</w:t>
+      </w:r>
+    </w:p>
+    <w:p>
+      <w:pPr>
+        <w:pStyle w:val="normal1"/>
+        <w:numPr>
+          <w:ilvl w:val="0"/>
+          <w:numId w:val="1"/>
+        </w:numPr>
+        <w:spacing w:before="0" w:after="0"/>
+        <w:ind w:hanging="360" w:left="720"/>
+        <w:rPr/>
+      </w:pPr>
+      <w:r>
+        <w:rPr>
+          <w:rFonts w:eastAsia="Calibri" w:cs="Calibri"/>
           <w:sz w:val="22"/>
           <w:szCs w:val="22"/>
         </w:rPr>
@@ -522,7 +541,7 @@
       <w:r>
         <w:rPr>
           <w:rFonts w:eastAsia="Calibri" w:cs="Calibri"/>
-          <w:b w:val="0"/>
+          <w:b w:val="false"/>
           <w:sz w:val="22"/>
           <w:szCs w:val="22"/>
         </w:rPr>
@@ -537,10 +556,29 @@
       </w:r>
       <w:r>
         <w:rPr>
-          <w:b w:val="0"/>
+          <w:b w:val="false"/>
           <w:sz w:val="22"/>
         </w:rPr>
         <w:t xml:space="preserve"> Talking with Romano about your writing stays optional, here as everywhere.</w:t>
+      </w:r>
+    </w:p>
+    <w:p>
+      <w:pPr>
+        <w:pStyle w:val="Heading2"/>
+        <w:rPr>
+          <w:rFonts w:eastAsia="Calibri" w:cs="Calibri"/>
+          <w:b/>
+          <w:bCs/>
+          <w:color w:val="4F81BD"/>
+          <w:sz w:val="26"/>
+          <w:szCs w:val="26"/>
+        </w:rPr>
+      </w:pPr>
+      <w:r>
+        <w:rPr/>
+      </w:r>
+      <w:r>
+        <w:br w:type="page"/>
       </w:r>
     </w:p>
     <w:p>
@@ -573,11 +611,11 @@
           <w:bottom w:w="40" w:type="dxa"/>
           <w:right w:w="108" w:type="dxa"/>
         </w:tblCellMar>
-        <w:tblLook w:noVBand="1" w:firstColumn="1" w:val="07e0"/>
+        <w:tblLook w:val="07e0" w:noVBand="1" w:firstColumn="1"/>
       </w:tblPr>
       <w:tblGrid>
         <w:gridCol w:w="2325"/>
-        <w:gridCol w:w="8475"/>
+        <w:gridCol w:w="8474"/>
       </w:tblGrid>
       <w:tr>
         <w:trPr/>
@@ -611,7 +649,7 @@
         </w:tc>
         <w:tc>
           <w:tcPr>
-            <w:tcW w:w="8475" w:type="dxa"/>
+            <w:tcW w:w="8474" w:type="dxa"/>
             <w:tcBorders>
               <w:top w:val="single" w:sz="4" w:space="0" w:color="000000"/>
               <w:left w:val="single" w:sz="4" w:space="0" w:color="000000"/>
@@ -668,7 +706,7 @@
         </w:tc>
         <w:tc>
           <w:tcPr>
-            <w:tcW w:w="8475" w:type="dxa"/>
+            <w:tcW w:w="8474" w:type="dxa"/>
             <w:tcBorders>
               <w:top w:val="single" w:sz="4" w:space="0" w:color="000000"/>
               <w:left w:val="single" w:sz="4" w:space="0" w:color="000000"/>
@@ -725,7 +763,7 @@
         </w:tc>
         <w:tc>
           <w:tcPr>
-            <w:tcW w:w="8475" w:type="dxa"/>
+            <w:tcW w:w="8474" w:type="dxa"/>
             <w:tcBorders>
               <w:top w:val="single" w:sz="4" w:space="0" w:color="000000"/>
               <w:left w:val="single" w:sz="4" w:space="0" w:color="000000"/>
@@ -1083,7 +1121,7 @@
     </w:rPr>
   </w:style>
   <w:style w:type="paragraph" w:styleId="Heading1">
-    <w:name w:val="heading 1"/>
+    <w:name w:val="Heading 1"/>
     <w:basedOn w:val="normal1"/>
     <w:next w:val="normal1"/>
     <w:qFormat/>
@@ -1102,7 +1140,7 @@
     </w:rPr>
   </w:style>
   <w:style w:type="paragraph" w:styleId="Heading2">
-    <w:name w:val="heading 2"/>
+    <w:name w:val="Heading 2"/>
     <w:basedOn w:val="normal1"/>
     <w:next w:val="normal1"/>
     <w:qFormat/>
@@ -1121,7 +1159,7 @@
     </w:rPr>
   </w:style>
   <w:style w:type="paragraph" w:styleId="Heading3">
-    <w:name w:val="heading 3"/>
+    <w:name w:val="Heading 3"/>
     <w:basedOn w:val="normal1"/>
     <w:next w:val="normal1"/>
     <w:qFormat/>
@@ -1138,7 +1176,7 @@
     </w:rPr>
   </w:style>
   <w:style w:type="paragraph" w:styleId="Heading4">
-    <w:name w:val="heading 4"/>
+    <w:name w:val="Heading 4"/>
     <w:basedOn w:val="normal1"/>
     <w:next w:val="normal1"/>
     <w:qFormat/>
@@ -1157,7 +1195,7 @@
     </w:rPr>
   </w:style>
   <w:style w:type="paragraph" w:styleId="Heading5">
-    <w:name w:val="heading 5"/>
+    <w:name w:val="Heading 5"/>
     <w:basedOn w:val="normal1"/>
     <w:next w:val="normal1"/>
     <w:qFormat/>
@@ -1172,7 +1210,7 @@
     </w:rPr>
   </w:style>
   <w:style w:type="paragraph" w:styleId="Heading6">
-    <w:name w:val="heading 6"/>
+    <w:name w:val="Heading 6"/>
     <w:basedOn w:val="normal1"/>
     <w:next w:val="normal1"/>
     <w:qFormat/>
@@ -1446,7 +1484,7 @@
     </w:rPr>
   </w:style>
   <w:style w:type="paragraph" w:styleId="Caption">
-    <w:name w:val="caption"/>
+    <w:name w:val="Caption"/>
     <w:basedOn w:val="Normal"/>
     <w:qFormat/>
     <w:pPr>
@@ -1553,34 +1591,34 @@
         <a:srgbClr val="000000"/>
       </a:dk1>
       <a:lt1>
-        <a:srgbClr val="FFFFFF"/>
+        <a:srgbClr val="ffffff"/>
       </a:lt1>
       <a:dk2>
-        <a:srgbClr val="1F497D"/>
+        <a:srgbClr val="1f497d"/>
       </a:dk2>
       <a:lt2>
-        <a:srgbClr val="EEECE1"/>
+        <a:srgbClr val="eeece1"/>
       </a:lt2>
       <a:accent1>
-        <a:srgbClr val="4F81BD"/>
+        <a:srgbClr val="4f81bd"/>
       </a:accent1>
       <a:accent2>
-        <a:srgbClr val="C0504D"/>
+        <a:srgbClr val="c0504d"/>
       </a:accent2>
       <a:accent3>
-        <a:srgbClr val="9BBB59"/>
+        <a:srgbClr val="9bbb59"/>
       </a:accent3>
       <a:accent4>
-        <a:srgbClr val="8064A2"/>
+        <a:srgbClr val="8064a2"/>
       </a:accent4>
       <a:accent5>
-        <a:srgbClr val="4BACC6"/>
+        <a:srgbClr val="4bacc6"/>
       </a:accent5>
       <a:accent6>
-        <a:srgbClr val="F79646"/>
+        <a:srgbClr val="f79646"/>
       </a:accent6>
       <a:hlink>
-        <a:srgbClr val="0000FF"/>
+        <a:srgbClr val="0000ff"/>
       </a:hlink>
       <a:folHlink>
         <a:srgbClr val="800080"/>

</xml_diff>

<commit_message>
OP5 handout: one page
Todd's revision. The forced page break — an empty heading that existed to put
the rubric on a sheet of its own — is gone, and with Telefone out of the
assignment the whole handout now fits on one page: all five sections and the
full rubric, with room left over.

Fitting on one page is the thing the assignment asks of the students.

Text is otherwise unchanged from 66f42c5; verified by comparing the extracted
text of both versions, which differ only by the two blank lines the break
occupied.

Co-Authored-By: Claude Opus 5 (1M context) <noreply@anthropic.com>
</commit_message>
<xml_diff>
--- a/week-05-breaking-the-rules/OP5 Breaking the Rules.docx
+++ b/week-05-breaking-the-rules/OP5 Breaking the Rules.docx
@@ -74,7 +74,7 @@
           <w:sz w:val="22"/>
           <w:szCs w:val="22"/>
         </w:rPr>
-        <w:t xml:space="preserve">In Chapter 15 of Write What Matters, “Break the Rules in Style,” Romano opens with the following: “Be bad now and then . . . Break rules and see what shakes loose.” Winston Weathers called this Grammar B: a real, deliberate alternate style: sentence fragments, labyrinthine sentences, purposeful misspelling, double voice. Weathers’ point is that this is a style with rules of its own, not the absence of rules: every break has to earn its place, which asks more of you, not less.</w:t>
+        <w:t>In Chapter 15 of Write What Matters, “Break the Rules in Style,” Romano opens with the following: “Be bad now and then . . . Break rules and see what shakes loose.” Winston Weathers called this Grammar B: a real, deliberate alternate style: sentence fragments, labyrinthine sentences, purposeful misspelling, double voice. Weathers’ point is that this is a style with rules of its own, not the absence of rules: every break has to earn its place, which asks more of you, not less.</w:t>
       </w:r>
     </w:p>
     <w:p>
@@ -212,7 +212,7 @@
           <w:sz w:val="22"/>
           <w:szCs w:val="22"/>
         </w:rPr>
-        <w:t xml:space="preserve">real One-Pager</w:t>
+        <w:t>real One-Pager</w:t>
       </w:r>
       <w:r>
         <w:rPr>
@@ -221,7 +221,7 @@
           <w:sz w:val="22"/>
           <w:szCs w:val="22"/>
         </w:rPr>
-        <w:t xml:space="preserve">: your rule-breaking piece, on one page. Today’s gush can be the seed or you can start fresh. Keep it broken. Every “error” should be one you meant.</w:t>
+        <w:t>: your rule-breaking piece, on one page. Today’s gush can be the seed or you can start fresh. Keep it broken. Every “error” should be one you meant.</w:t>
       </w:r>
     </w:p>
     <w:p>
@@ -251,7 +251,7 @@
           <w:sz w:val="22"/>
           <w:szCs w:val="22"/>
         </w:rPr>
-        <w:t xml:space="preserve">Reflecting on Writing</w:t>
+        <w:t>Reflecting on Writing</w:t>
       </w:r>
       <w:r>
         <w:rPr>
@@ -307,7 +307,7 @@
           <w:sz w:val="22"/>
           <w:szCs w:val="22"/>
         </w:rPr>
-        <w:t xml:space="preserve">one page</w:t>
+        <w:t>one page</w:t>
       </w:r>
       <w:r>
         <w:rPr>
@@ -316,7 +316,7 @@
           <w:sz w:val="22"/>
           <w:szCs w:val="22"/>
         </w:rPr>
-        <w:t xml:space="preserve">, kept broken — at least two Grammar B moves, on purpose. Every “error” one you meant.</w:t>
+        <w:t>, kept broken — at least two Grammar B moves, on purpose. Every “error” one you meant.</w:t>
       </w:r>
     </w:p>
     <w:p>
@@ -346,7 +346,7 @@
           <w:sz w:val="22"/>
           <w:szCs w:val="22"/>
         </w:rPr>
-        <w:t xml:space="preserve">Export One-Pager (PDF)</w:t>
+        <w:t>Export One-Pager (PDF)</w:t>
       </w:r>
       <w:r>
         <w:rPr>
@@ -387,31 +387,13 @@
           <w:sz w:val="22"/>
           <w:szCs w:val="22"/>
         </w:rPr>
-        <w:t xml:space="preserve">Every broken rule should be one you meant. Grammar B is a style, not a licence — the judgment about what serves the writing is yours. Talking with Romano about your writing stays optional, here as everywhere.</w:t>
+        <w:t>Every broken rule should be one you meant. Grammar B is a style, not a licence — the judgment about what serves the writing is yours. Talking with Romano about your writing stays optional, here as everywhere.</w:t>
       </w:r>
     </w:p>
     <w:p>
       <w:pPr>
         <w:pStyle w:val="Heading2"/>
-        <w:rPr>
-          <w:rFonts w:eastAsia="Calibri" w:cs="Calibri"/>
-          <w:b/>
-          <w:bCs/>
-          <w:color w:val="4F81BD"/>
-          <w:sz w:val="26"/>
-          <w:szCs w:val="26"/>
-        </w:rPr>
-      </w:pPr>
-      <w:r>
-        <w:rPr/>
-      </w:r>
-      <w:r>
-        <w:br w:type="page"/>
-      </w:r>
-    </w:p>
-    <w:p>
-      <w:pPr>
-        <w:pStyle w:val="Heading2"/>
+        <w:spacing w:before="0" w:after="0"/>
         <w:rPr/>
       </w:pPr>
       <w:r>
@@ -471,7 +453,7 @@
                 <w:sz w:val="22"/>
                 <w:szCs w:val="22"/>
               </w:rPr>
-              <w:t xml:space="preserve">Rule-breaking that works (5)</w:t>
+              <w:t>Rule-breaking that works (5)</w:t>
             </w:r>
           </w:p>
         </w:tc>
@@ -497,7 +479,7 @@
                 <w:sz w:val="22"/>
                 <w:szCs w:val="22"/>
               </w:rPr>
-              <w:t xml:space="preserve">At least two Grammar B moves — fragments, labyrinthine sentences, purposeful misspelling, double voice — deliberate and meaningful. Every “error” one you meant, serving the writing, not careless.</w:t>
+              <w:t>At least two Grammar B moves — fragments, labyrinthine sentences, purposeful misspelling, double voice — deliberate and meaningful. Every “error” one you meant, serving the writing, not careless.</w:t>
             </w:r>
           </w:p>
         </w:tc>
@@ -528,7 +510,7 @@
                 <w:sz w:val="22"/>
                 <w:szCs w:val="22"/>
               </w:rPr>
-              <w:t xml:space="preserve">Something that matters (3)</w:t>
+              <w:t>Something that matters (3)</w:t>
             </w:r>
           </w:p>
         </w:tc>
@@ -554,7 +536,7 @@
                 <w:sz w:val="22"/>
                 <w:szCs w:val="22"/>
               </w:rPr>
-              <w:t xml:space="preserve">A real subject of yours, particular and un-generic — worth breaking the rules for.</w:t>
+              <w:t>A real subject of yours, particular and un-generic — worth breaking the rules for.</w:t>
             </w:r>
           </w:p>
         </w:tc>
@@ -585,7 +567,7 @@
                 <w:sz w:val="22"/>
                 <w:szCs w:val="22"/>
               </w:rPr>
-              <w:t xml:space="preserve">Format (2)</w:t>
+              <w:t>Format (2)</w:t>
             </w:r>
           </w:p>
         </w:tc>
@@ -611,7 +593,7 @@
                 <w:sz w:val="22"/>
                 <w:szCs w:val="22"/>
               </w:rPr>
-              <w:t xml:space="preserve">One page, kept broken, with the Reflecting on Writing note. Submitted as the one PDF Journaler exports.</w:t>
+              <w:t>One page, kept broken, with the Reflecting on Writing note. Submitted as the one PDF Journaler exports.</w:t>
             </w:r>
           </w:p>
         </w:tc>

</xml_diff>